<commit_message>
Replace the v3 label with synthetic-data names in scripts, results and docs
</commit_message>
<xml_diff>
--- a/Data_and_Models/3_Final_system/docs/phase2_results.docx
+++ b/Data_and_Models/3_Final_system/docs/phase2_results.docx
@@ -432,7 +432,7 @@
               <w:rPr>
                 <w:sz w:val="17"/>
               </w:rPr>
-              <w:t>Synthetic data (v3) vs real-only</w:t>
+              <w:t xml:space="preserve">Synthetic data vs real-only</w:t>
             </w:r>
           </w:p>
         </w:tc>
@@ -2269,7 +2269,7 @@
         <w:pStyle w:val="Heading2"/>
       </w:pPr>
       <w:r>
-        <w:t xml:space="preserve">5. Synthetic data (v3) — audit and experiments</w:t>
+        <w:t xml:space="preserve">5. Synthetic data — audit and experiments</w:t>
       </w:r>
     </w:p>
     <w:p>
@@ -2405,7 +2405,7 @@
               <w:rPr>
                 <w:sz w:val="17"/>
               </w:rPr>
-              <w:t>v3 + Config B + FFT vs real-only (step 06)</w:t>
+              <w:t xml:space="preserve">synthetic + Config B + FFT vs real-only (step 06)</w:t>
             </w:r>
           </w:p>
         </w:tc>
@@ -2920,7 +2920,7 @@
               <w:rPr>
                 <w:sz w:val="17"/>
               </w:rPr>
-              <w:t xml:space="preserve">the synthetic-data model (CatBoost + v3 + B + FFT)</w:t>
+              <w:t xml:space="preserve">the synthetic-data model (CatBoost + synthetic + B + FFT)</w:t>
             </w:r>
           </w:p>
         </w:tc>
@@ -4491,7 +4491,7 @@
               <w:rPr>
                 <w:sz w:val="17"/>
               </w:rPr>
-              <w:t>CatBoost 11-class classifier, 496 features (Config B + FFT + G1 G2 G3), real 935 + 4,250 v3 synthetic windows (5,185 rows)</w:t>
+              <w:t xml:space="preserve">CatBoost 11-class classifier, 496 features (Config B + FFT + G1 G2 G3), real 935 + 4,250 synthetic windows (5,185 rows)</w:t>
             </w:r>
           </w:p>
         </w:tc>

</xml_diff>